<commit_message>
docs(lab3): enrich D3-3 and D3-4 reports
</commit_message>
<xml_diff>
--- a/实验三_DevOps流水线与容器化部署/D3-3_Dockerfile与镜像扫描报告.docx
+++ b/实验三_DevOps流水线与容器化部署/D3-3_Dockerfile与镜像扫描报告.docx
@@ -16,23 +16,7 @@
           <w:sz w:val="28"/>
           <w:lang w:eastAsia="zh-CN"/>
         </w:rPr>
-        <w:t>北京林业大学</w:t>
-      </w:r>
-      <w:r>
-        <w:rPr>
-          <w:color w:val="777777"/>
-          <w:sz w:val="28"/>
-          <w:lang w:eastAsia="zh-CN"/>
-        </w:rPr>
-        <w:t xml:space="preserve"> · </w:t>
-      </w:r>
-      <w:r>
-        <w:rPr>
-          <w:color w:val="777777"/>
-          <w:sz w:val="28"/>
-          <w:lang w:eastAsia="zh-CN"/>
-        </w:rPr>
-        <w:t>信息学院</w:t>
+        <w:t>北京林业大学 · 信息学院</w:t>
       </w:r>
     </w:p>
     <w:p>
@@ -60,15 +44,7 @@
           <w:color w:val="1A7A3D"/>
           <w:sz w:val="56"/>
         </w:rPr>
-        <w:t xml:space="preserve">Dockerfile </w:t>
-      </w:r>
-      <w:r>
-        <w:rPr>
-          <w:b/>
-          <w:color w:val="1A7A3D"/>
-          <w:sz w:val="56"/>
-        </w:rPr>
-        <w:t>与镜像扫描报告</w:t>
+        <w:t>Dockerfile 与镜像扫描报告</w:t>
       </w:r>
     </w:p>
     <w:p>
@@ -95,39 +71,7 @@
           <w:color w:val="2E9B55"/>
           <w:sz w:val="26"/>
         </w:rPr>
-        <w:t xml:space="preserve">—— </w:t>
-      </w:r>
-      <w:r>
-        <w:rPr>
-          <w:b/>
-          <w:color w:val="2E9B55"/>
-          <w:sz w:val="26"/>
-        </w:rPr>
-        <w:t>案例：</w:t>
-      </w:r>
-      <w:r>
-        <w:rPr>
-          <w:b/>
-          <w:color w:val="2E9B55"/>
-          <w:sz w:val="26"/>
-        </w:rPr>
-        <w:t xml:space="preserve">NekoCafé </w:t>
-      </w:r>
-      <w:r>
-        <w:rPr>
-          <w:b/>
-          <w:color w:val="2E9B55"/>
-          <w:sz w:val="26"/>
-        </w:rPr>
-        <w:t>猫咪主题餐饮预约平台</w:t>
-      </w:r>
-      <w:r>
-        <w:rPr>
-          <w:b/>
-          <w:color w:val="2E9B55"/>
-          <w:sz w:val="26"/>
-        </w:rPr>
-        <w:t xml:space="preserve"> ——</w:t>
+        <w:t>—— 案例：NekoCafé 猫咪主题餐饮预约平台 ——</w:t>
       </w:r>
     </w:p>
     <w:p/>
@@ -246,13 +190,7 @@
               <w:rPr>
                 <w:color w:val="2B2B2B"/>
               </w:rPr>
-              <w:t xml:space="preserve">Dockerfile </w:t>
-            </w:r>
-            <w:r>
-              <w:rPr>
-                <w:color w:val="2B2B2B"/>
-              </w:rPr>
-              <w:t>与镜像扫描报告</w:t>
+              <w:t>Dockerfile 与镜像扫描报告</w:t>
             </w:r>
           </w:p>
         </w:tc>
@@ -307,19 +245,7 @@
               <w:rPr>
                 <w:color w:val="2B2B2B"/>
               </w:rPr>
-              <w:t>实验三</w:t>
-            </w:r>
-            <w:r>
-              <w:rPr>
-                <w:color w:val="2B2B2B"/>
-              </w:rPr>
-              <w:t xml:space="preserve">  DevOps </w:t>
-            </w:r>
-            <w:r>
-              <w:rPr>
-                <w:color w:val="2B2B2B"/>
-              </w:rPr>
-              <w:t>流水线与容器化部署</w:t>
+              <w:t>实验三  DevOps 流水线与容器化部署</w:t>
             </w:r>
           </w:p>
         </w:tc>
@@ -378,14 +304,7 @@
                 <w:color w:val="2B2B2B"/>
                 <w:lang w:eastAsia="zh-CN"/>
               </w:rPr>
-              <w:t xml:space="preserve">NekoCafé </w:t>
-            </w:r>
-            <w:r>
-              <w:rPr>
-                <w:color w:val="2B2B2B"/>
-                <w:lang w:eastAsia="zh-CN"/>
-              </w:rPr>
-              <w:t>猫咪主题餐饮预约平台</w:t>
+              <w:t>NekoCafé 猫咪主题餐饮预约平台</w:t>
             </w:r>
           </w:p>
         </w:tc>
@@ -471,35 +390,7 @@
                 <w:b/>
                 <w:color w:val="1A7A3D"/>
               </w:rPr>
-              <w:t>班级</w:t>
-            </w:r>
-            <w:r>
-              <w:rPr>
-                <w:b/>
-                <w:color w:val="1A7A3D"/>
-              </w:rPr>
-              <w:t xml:space="preserve"> / </w:t>
-            </w:r>
-            <w:r>
-              <w:rPr>
-                <w:b/>
-                <w:color w:val="1A7A3D"/>
-              </w:rPr>
-              <w:t>学号</w:t>
-            </w:r>
-            <w:r>
-              <w:rPr>
-                <w:b/>
-                <w:color w:val="1A7A3D"/>
-              </w:rPr>
-              <w:t xml:space="preserve"> / </w:t>
-            </w:r>
-            <w:r>
-              <w:rPr>
-                <w:b/>
-                <w:color w:val="1A7A3D"/>
-              </w:rPr>
-              <w:t>姓名</w:t>
+              <w:t>班级 / 学号 / 姓名</w:t>
             </w:r>
           </w:p>
         </w:tc>
@@ -517,13 +408,7 @@
           </w:tcPr>
           <w:p>
             <w:r>
-              <w:t>计算机</w:t>
-            </w:r>
-            <w:r>
-              <w:t xml:space="preserve">23-2 / 231002703 / </w:t>
-            </w:r>
-            <w:r>
-              <w:t>戴正宇</w:t>
+              <w:t>计算机23-2 / 231002703 / 戴正宇</w:t>
             </w:r>
           </w:p>
         </w:tc>
@@ -615,35 +500,7 @@
           <w:color w:val="2B2B2B"/>
           <w:lang w:eastAsia="zh-CN"/>
         </w:rPr>
-        <w:t>证明你的镜像满足</w:t>
-      </w:r>
-      <w:r>
-        <w:rPr>
-          <w:color w:val="2B2B2B"/>
-          <w:lang w:eastAsia="zh-CN"/>
-        </w:rPr>
-        <w:t>"</w:t>
-      </w:r>
-      <w:r>
-        <w:rPr>
-          <w:color w:val="2B2B2B"/>
-          <w:lang w:eastAsia="zh-CN"/>
-        </w:rPr>
-        <w:t>小、快、安全</w:t>
-      </w:r>
-      <w:r>
-        <w:rPr>
-          <w:color w:val="2B2B2B"/>
-          <w:lang w:eastAsia="zh-CN"/>
-        </w:rPr>
-        <w:t>"</w:t>
-      </w:r>
-      <w:r>
-        <w:rPr>
-          <w:color w:val="2B2B2B"/>
-          <w:lang w:eastAsia="zh-CN"/>
-        </w:rPr>
-        <w:t>三大目标。</w:t>
+        <w:t>证明你的镜像满足"小、快、安全"三大目标。</w:t>
       </w:r>
     </w:p>
     <w:tbl>
@@ -724,16 +581,7 @@
           <w:sz w:val="36"/>
           <w:lang w:eastAsia="zh-CN"/>
         </w:rPr>
-        <w:t xml:space="preserve">1  Dockerfile </w:t>
-      </w:r>
-      <w:r>
-        <w:rPr>
-          <w:b/>
-          <w:color w:val="1A7A3D"/>
-          <w:sz w:val="36"/>
-          <w:lang w:eastAsia="zh-CN"/>
-        </w:rPr>
-        <w:t>设计说明</w:t>
+        <w:t>1  Dockerfile 设计说明</w:t>
       </w:r>
     </w:p>
     <w:p>
@@ -754,16 +602,7 @@
           <w:sz w:val="30"/>
           <w:lang w:eastAsia="zh-CN"/>
         </w:rPr>
-        <w:t xml:space="preserve">1.1  </w:t>
-      </w:r>
-      <w:r>
-        <w:rPr>
-          <w:b/>
-          <w:color w:val="1A7A3D"/>
-          <w:sz w:val="30"/>
-          <w:lang w:eastAsia="zh-CN"/>
-        </w:rPr>
-        <w:t>基础镜像选型理由</w:t>
+        <w:t>1.1  基础镜像选型理由</w:t>
       </w:r>
     </w:p>
     <w:tbl>
@@ -797,64 +636,13 @@
               </w:rPr>
             </w:pPr>
             <w:r>
-              <w:rPr>
-                <w:lang w:eastAsia="zh-CN"/>
-              </w:rPr>
-              <w:t>预约服务选</w:t>
+              <w:t>预约服务选用 python:3.12-alpine，会员服务选用 node:20-alpine。选型理由包括：二者均为官方维护镜像，安全公告和补丁响应及时；alpine 体积较小，适合课程 PoC 快速拉取与构建；两个服务几乎不依赖外部运行库，使用轻量基础镜像不会带来兼容性负担。镜像设计目标是“小、快、安全”：小是指运行层只保留源码和必要运行时；快是指多阶段构建可复用缓存并在 CI 中快速完成；安全是指非 root 运行、健康检查、Trivy 阈值阻断和最小运行时组件。</w:t>
             </w:r>
+          </w:p>
+          <w:p>
+            <w:pPr/>
             <w:r>
-              <w:rPr>
-                <w:lang w:eastAsia="zh-CN"/>
-              </w:rPr>
-              <w:t xml:space="preserve"> python:3.12-alpine</w:t>
-            </w:r>
-            <w:r>
-              <w:rPr>
-                <w:lang w:eastAsia="zh-CN"/>
-              </w:rPr>
-              <w:t>，会员服务选</w:t>
-            </w:r>
-            <w:r>
-              <w:rPr>
-                <w:lang w:eastAsia="zh-CN"/>
-              </w:rPr>
-              <w:t xml:space="preserve"> node:20-alpine</w:t>
-            </w:r>
-            <w:r>
-              <w:rPr>
-                <w:lang w:eastAsia="zh-CN"/>
-              </w:rPr>
-              <w:t>。原因：基础镜像小、官方维护、适合无外部依赖</w:t>
-            </w:r>
-            <w:r>
-              <w:rPr>
-                <w:lang w:eastAsia="zh-CN"/>
-              </w:rPr>
-              <w:t xml:space="preserve"> </w:t>
-            </w:r>
-            <w:r>
-              <w:rPr>
-                <w:lang w:eastAsia="zh-CN"/>
-              </w:rPr>
-              <w:t>PoC</w:t>
-            </w:r>
-            <w:r>
-              <w:rPr>
-                <w:lang w:eastAsia="zh-CN"/>
-              </w:rPr>
-              <w:t>；最终镜像不包含测试目录和构建缓存，目标大小低于</w:t>
-            </w:r>
-            <w:r>
-              <w:rPr>
-                <w:lang w:eastAsia="zh-CN"/>
-              </w:rPr>
-              <w:t xml:space="preserve"> 200MB</w:t>
-            </w:r>
-            <w:r>
-              <w:rPr>
-                <w:lang w:eastAsia="zh-CN"/>
-              </w:rPr>
-              <w:t>。</w:t>
+              <w:t>基础镜像约束：本实验不使用 latest 作为长期生产标签，文档中记录 3.12 与 20 两个主版本，便于后续按安全公告升级小版本。若未来引入数据库客户端、加密库或图片处理等 native 依赖，应重新评估 alpine 与 slim 镜像的兼容性和体积差异。</w:t>
             </w:r>
           </w:p>
           <w:p>
@@ -870,22 +658,26 @@
               <w:jc w:val="center"/>
             </w:pPr>
             <w:r>
+              <w:rPr>
+                <w:noProof/>
+              </w:rPr>
               <w:drawing>
-                <wp:inline xmlns:a="http://schemas.openxmlformats.org/drawingml/2006/main" xmlns:pic="http://schemas.openxmlformats.org/drawingml/2006/picture">
+                <wp:inline distT="0" distB="0" distL="0" distR="0" wp14:anchorId="761F8D7F" wp14:editId="33844815">
                   <wp:extent cx="5760720" cy="3173509"/>
+                  <wp:effectExtent l="0" t="0" r="0" b="0"/>
                   <wp:docPr id="3" name="Picture 3"/>
                   <wp:cNvGraphicFramePr>
-                    <a:graphicFrameLocks noChangeAspect="1"/>
+                    <a:graphicFrameLocks xmlns:a="http://schemas.openxmlformats.org/drawingml/2006/main" noChangeAspect="1"/>
                   </wp:cNvGraphicFramePr>
-                  <a:graphic>
+                  <a:graphic xmlns:a="http://schemas.openxmlformats.org/drawingml/2006/main">
                     <a:graphicData uri="http://schemas.openxmlformats.org/drawingml/2006/picture">
-                      <pic:pic>
+                      <pic:pic xmlns:pic="http://schemas.openxmlformats.org/drawingml/2006/picture">
                         <pic:nvPicPr>
                           <pic:cNvPr id="0" name="image.png"/>
                           <pic:cNvPicPr/>
                         </pic:nvPicPr>
                         <pic:blipFill>
-                          <a:blip r:embed="rId10"/>
+                          <a:blip r:embed="rId6"/>
                           <a:stretch>
                             <a:fillRect/>
                           </a:stretch>
@@ -895,7 +687,9 @@
                             <a:off x="0" y="0"/>
                             <a:ext cx="5760720" cy="3173509"/>
                           </a:xfrm>
-                          <a:prstGeom prst="rect"/>
+                          <a:prstGeom prst="rect">
+                            <a:avLst/>
+                          </a:prstGeom>
                         </pic:spPr>
                       </pic:pic>
                     </a:graphicData>
@@ -908,12 +702,14 @@
             <w:pPr>
               <w:jc w:val="center"/>
               <w:rPr>
+                <w:iCs/>
                 <w:lang w:eastAsia="zh-CN"/>
               </w:rPr>
             </w:pPr>
             <w:r>
               <w:rPr>
-                <w:i/>
+                <w:iCs/>
+                <w:lang w:eastAsia="zh-CN"/>
               </w:rPr>
               <w:t>图3-2 Docker 镜像构建与扫描链路</w:t>
             </w:r>
@@ -943,15 +739,7 @@
           <w:sz w:val="30"/>
         </w:rPr>
         <w:lastRenderedPageBreak/>
-        <w:t xml:space="preserve">1.2  </w:t>
-      </w:r>
-      <w:r>
-        <w:rPr>
-          <w:b/>
-          <w:color w:val="1A7A3D"/>
-          <w:sz w:val="30"/>
-        </w:rPr>
-        <w:t>多阶段构建拆解</w:t>
+        <w:t>1.2  多阶段构建拆解</w:t>
       </w:r>
     </w:p>
     <w:tbl>
@@ -980,49 +768,13 @@
           </w:tcPr>
           <w:p>
             <w:r>
-              <w:t>多阶段构建：</w:t>
+              <w:t>多阶段构建：两个服务均拆分为 test 与 runtime 两个阶段。test 阶段负责复制源码和测试目录并执行单元测试，保证镜像构建时即可发现基础逻辑错误；runtime 阶段只复制运行所需的 src 文件和必要元数据，不携带测试目录、缓存目录和构建中间产物。这样既减少镜像体积，也避免把测试数据、临时文件和开发工具带入运行环境。</w:t>
             </w:r>
+          </w:p>
+          <w:p>
+            <w:pPr/>
             <w:r>
-              <w:t xml:space="preserve">test </w:t>
-            </w:r>
-            <w:r>
-              <w:t>阶段复制源代码并运行单元测试；</w:t>
-            </w:r>
-            <w:r>
-              <w:t xml:space="preserve">runtime </w:t>
-            </w:r>
-            <w:r>
-              <w:t>阶段只复制运行所需</w:t>
-            </w:r>
-            <w:r>
-              <w:t xml:space="preserve"> src </w:t>
-            </w:r>
-            <w:r>
-              <w:t>文件和</w:t>
-            </w:r>
-            <w:r>
-              <w:t xml:space="preserve"> package </w:t>
-            </w:r>
-            <w:r>
-              <w:t>元数据；两个服务均设置非</w:t>
-            </w:r>
-            <w:r>
-              <w:t xml:space="preserve"> root </w:t>
-            </w:r>
-            <w:r>
-              <w:t>用户、</w:t>
-            </w:r>
-            <w:r>
-              <w:t xml:space="preserve">HEALTHCHECK </w:t>
-            </w:r>
-            <w:r>
-              <w:t>和</w:t>
-            </w:r>
-            <w:r>
-              <w:t xml:space="preserve"> PORT </w:t>
-            </w:r>
-            <w:r>
-              <w:t>环境变量。</w:t>
+              <w:t>reservation-service 的 runtime 仅保留 Python 标准库运行环境和 /app/src；member-service 的 runtime 在复制源码后移除 npm、npx、corepack 和 yarn 等包管理工具，降低 Trivy 对运行时工具链的扫描暴露面。两个 Dockerfile 都通过 HEALTHCHECK 声明容器健康状态，便于 Compose、Kubernetes 和 CI/CD 统一判断服务是否可用。</w:t>
             </w:r>
           </w:p>
         </w:tc>
@@ -1043,31 +795,7 @@
           <w:color w:val="1A7A3D"/>
           <w:sz w:val="30"/>
         </w:rPr>
-        <w:t xml:space="preserve">1.3  </w:t>
-      </w:r>
-      <w:r>
-        <w:rPr>
-          <w:b/>
-          <w:color w:val="1A7A3D"/>
-          <w:sz w:val="30"/>
-        </w:rPr>
-        <w:t>非</w:t>
-      </w:r>
-      <w:r>
-        <w:rPr>
-          <w:b/>
-          <w:color w:val="1A7A3D"/>
-          <w:sz w:val="30"/>
-        </w:rPr>
-        <w:t xml:space="preserve"> root </w:t>
-      </w:r>
-      <w:r>
-        <w:rPr>
-          <w:b/>
-          <w:color w:val="1A7A3D"/>
-          <w:sz w:val="30"/>
-        </w:rPr>
-        <w:t>用户与最小权限</w:t>
+        <w:t>1.3  非 root 用户与最小权限</w:t>
       </w:r>
     </w:p>
     <w:tbl>
@@ -1096,55 +824,13 @@
           </w:tcPr>
           <w:p>
             <w:r>
-              <w:t>非</w:t>
+              <w:rPr>
+                <w:b/>
+              </w:rPr>
+              <w:t>非 root：</w:t>
             </w:r>
             <w:r>
-              <w:t xml:space="preserve"> root</w:t>
-            </w:r>
-            <w:r>
-              <w:t>：</w:t>
-            </w:r>
-            <w:r>
-              <w:t xml:space="preserve">reservation </w:t>
-            </w:r>
-            <w:r>
-              <w:t>使用</w:t>
-            </w:r>
-            <w:r>
-              <w:t xml:space="preserve"> adduser app</w:t>
-            </w:r>
-            <w:r>
-              <w:t>；</w:t>
-            </w:r>
-            <w:r>
-              <w:t xml:space="preserve">member </w:t>
-            </w:r>
-            <w:r>
-              <w:t>使用</w:t>
-            </w:r>
-            <w:r>
-              <w:t xml:space="preserve"> node </w:t>
-            </w:r>
-            <w:r>
-              <w:t>镜像内置</w:t>
-            </w:r>
-            <w:r>
-              <w:t xml:space="preserve"> node </w:t>
-            </w:r>
-            <w:r>
-              <w:t>用户。容器只监听</w:t>
-            </w:r>
-            <w:r>
-              <w:t xml:space="preserve"> 8080</w:t>
-            </w:r>
-            <w:r>
-              <w:t>，不写入镜像目录；需要写临时文件时使用</w:t>
-            </w:r>
-            <w:r>
-              <w:t xml:space="preserve"> /tmp</w:t>
-            </w:r>
-            <w:r>
-              <w:t>。</w:t>
+              <w:t>reservation 在 runtime 阶段创建 app 用户并切换到该用户运行；member 使用 node:20-alpine 内置 node 用户。容器只监听 8080，不需要特权端口，不写入镜像目录；如需临时文件，限定使用 /tmp。该设计能减少容器逃逸或应用漏洞造成的权限放大风险，并与 D3-5 中的 readOnlyRootFilesystem、drop capabilities 等 Kubernetes 安全上下文保持一致。</w:t>
             </w:r>
           </w:p>
         </w:tc>
@@ -1177,31 +863,19 @@
           </w:tcPr>
           <w:p>
             <w:r>
+              <w:rPr>
+                <w:b/>
+              </w:rPr>
               <w:t>构建命令：</w:t>
             </w:r>
             <w:r>
-              <w:t>docker build -t nekocafe/reservation:0.1.0 services/reservation</w:t>
+              <w:t>本地可执行 docker build -t nekocafe/reservation:0.1.0 services/reservation 与 docker build -t nekocafe/member:0.1.0 services/member；也可以在 D3-2 目录执行 make build 统一构建。Compose 演示环境通过 make up 触发 docker compose up -d --build，保证构建与运行使用同一套 Dockerfile。</w:t>
             </w:r>
+          </w:p>
+          <w:p>
+            <w:pPr/>
             <w:r>
-              <w:t>；</w:t>
-            </w:r>
-            <w:r>
-              <w:t>docker build -t nekocafe/member:0.1.0 services/member</w:t>
-            </w:r>
-            <w:r>
-              <w:t>。</w:t>
-            </w:r>
-            <w:r>
-              <w:t xml:space="preserve">Compose </w:t>
-            </w:r>
-            <w:r>
-              <w:t>构建由</w:t>
-            </w:r>
-            <w:r>
-              <w:t xml:space="preserve"> make build </w:t>
-            </w:r>
-            <w:r>
-              <w:t>封装。</w:t>
+              <w:t>成功标准：镜像构建完成后应能通过 docker run 或 docker compose 启动，/healthz 返回健康状态，/metrics 返回 Prometheus 文本格式指标。失败处理：若 Dockerfile COPY 路径错误，优先检查构建上下文；若测试阶段失败，先在本地运行对应测试命令；若运行阶段启动失败，检查 CMD、工作目录、端口和环境变量是否一致。</w:t>
             </w:r>
           </w:p>
         </w:tc>
@@ -1222,15 +896,7 @@
           <w:color w:val="1A7A3D"/>
           <w:sz w:val="36"/>
         </w:rPr>
-        <w:t xml:space="preserve">2  </w:t>
-      </w:r>
-      <w:r>
-        <w:rPr>
-          <w:b/>
-          <w:color w:val="1A7A3D"/>
-          <w:sz w:val="36"/>
-        </w:rPr>
-        <w:t>镜像大小与构建时长</w:t>
+        <w:t>2  镜像大小与构建时长</w:t>
       </w:r>
     </w:p>
     <w:tbl>
@@ -1406,10 +1072,7 @@
           </w:tcPr>
           <w:p>
             <w:r>
-              <w:t>约</w:t>
-            </w:r>
-            <w:r>
-              <w:t xml:space="preserve"> 65 MB</w:t>
+              <w:t>约 65 MB</w:t>
             </w:r>
           </w:p>
         </w:tc>
@@ -1419,10 +1082,7 @@
           </w:tcPr>
           <w:p>
             <w:r>
-              <w:t>约</w:t>
-            </w:r>
-            <w:r>
-              <w:t xml:space="preserve"> 45s</w:t>
+              <w:t>约 45s</w:t>
             </w:r>
           </w:p>
         </w:tc>
@@ -1442,13 +1102,7 @@
           </w:tcPr>
           <w:p>
             <w:r>
-              <w:t>标准库</w:t>
-            </w:r>
-            <w:r>
-              <w:t xml:space="preserve"> HTTP </w:t>
-            </w:r>
-            <w:r>
-              <w:t>服务</w:t>
+              <w:t>标准库 HTTP 服务</w:t>
             </w:r>
           </w:p>
         </w:tc>
@@ -1473,10 +1127,7 @@
           </w:tcPr>
           <w:p>
             <w:r>
-              <w:t>约</w:t>
-            </w:r>
-            <w:r>
-              <w:t xml:space="preserve"> 185 MB</w:t>
+              <w:t>约 185 MB</w:t>
             </w:r>
           </w:p>
         </w:tc>
@@ -1486,10 +1137,7 @@
           </w:tcPr>
           <w:p>
             <w:r>
-              <w:t>约</w:t>
-            </w:r>
-            <w:r>
-              <w:t xml:space="preserve"> 55s</w:t>
+              <w:t>约 55s</w:t>
             </w:r>
           </w:p>
         </w:tc>
@@ -1509,16 +1157,7 @@
           </w:tcPr>
           <w:p>
             <w:r>
-              <w:t xml:space="preserve">Node </w:t>
-            </w:r>
-            <w:r>
-              <w:t>标准库</w:t>
-            </w:r>
-            <w:r>
-              <w:t xml:space="preserve"> HTTP </w:t>
-            </w:r>
-            <w:r>
-              <w:t>服务</w:t>
+              <w:t>Node 标准库 HTTP 服务</w:t>
             </w:r>
           </w:p>
         </w:tc>
@@ -1551,28 +1190,13 @@
           </w:tcPr>
           <w:p>
             <w:r>
+              <w:rPr>
+                <w:b/>
+              </w:rPr>
               <w:t>扫描命令：</w:t>
             </w:r>
             <w:r>
-              <w:t xml:space="preserve">trivy image --severity HIGH,CRITICAL --exit-code 1 </w:t>
-            </w:r>
-            <w:r>
-              <w:t>nekocafe/reservation:0.1.0</w:t>
-            </w:r>
-            <w:r>
-              <w:t>；</w:t>
-            </w:r>
-            <w:r>
-              <w:t>trivy image --severity HIGH,CRITICAL --exit-code 1 nekocafe/member:0.1.0</w:t>
-            </w:r>
-            <w:r>
-              <w:t>。</w:t>
-            </w:r>
-            <w:r>
-              <w:t xml:space="preserve">CI </w:t>
-            </w:r>
-            <w:r>
-              <w:t>中同样执行该命令。</w:t>
+              <w:t>本地扫描可执行 trivy image --severity HIGH,CRITICAL --exit-code 1 nekocafe/reservation:0.1.0 与 trivy image --severity HIGH,CRITICAL --exit-code 1 nekocafe/member:0.1.0。CI 中对临时构建镜像执行同等阈值扫描，远端 GHCR 镜像也可通过 aquasec/trivy:latest 容器扫描。--exit-code 1 表示一旦发现 HIGH/CRITICAL 漏洞即让流水线失败，避免高危镜像进入部署阶段。</w:t>
             </w:r>
           </w:p>
         </w:tc>
@@ -1594,15 +1218,7 @@
           <w:sz w:val="36"/>
         </w:rPr>
         <w:lastRenderedPageBreak/>
-        <w:t xml:space="preserve">3  Trivy </w:t>
-      </w:r>
-      <w:r>
-        <w:rPr>
-          <w:b/>
-          <w:color w:val="1A7A3D"/>
-          <w:sz w:val="36"/>
-        </w:rPr>
-        <w:t>扫描报告</w:t>
+        <w:t>3  Trivy 扫描报告</w:t>
       </w:r>
     </w:p>
     <w:p>
@@ -1623,16 +1239,7 @@
           <w:sz w:val="30"/>
           <w:lang w:eastAsia="zh-CN"/>
         </w:rPr>
-        <w:t xml:space="preserve">3.1  </w:t>
-      </w:r>
-      <w:r>
-        <w:rPr>
-          <w:b/>
-          <w:color w:val="1A7A3D"/>
-          <w:sz w:val="30"/>
-          <w:lang w:eastAsia="zh-CN"/>
-        </w:rPr>
-        <w:t>漏洞概览（按严重度统计）</w:t>
+        <w:t>3.1  漏洞概览（按严重度统计）</w:t>
       </w:r>
     </w:p>
     <w:tbl>
@@ -1661,52 +1268,13 @@
           </w:tcPr>
           <w:p>
             <w:r>
-              <w:t xml:space="preserve">Trivy </w:t>
+              <w:t>Trivy 扫描已按 HIGH/CRITICAL 阈值对 reservation 与 member 两个镜像执行，当前实机扫描结果均为 0，满足任务书中“无 HIGH/CRITICAL 漏洞”的验收要求。扫描对象覆盖基础镜像系统包和语言包元数据：reservation 主要识别 alpine 与 Python 包信息，member 主要识别 alpine 与 Node package 信息。</w:t>
             </w:r>
+          </w:p>
+          <w:p>
+            <w:pPr/>
             <w:r>
-              <w:t>扫描已按</w:t>
-            </w:r>
-            <w:r>
-              <w:t xml:space="preserve"> HIGH/CRITICAL </w:t>
-            </w:r>
-            <w:r>
-              <w:t>阈值对</w:t>
-            </w:r>
-            <w:r>
-              <w:t xml:space="preserve"> reservation </w:t>
-            </w:r>
-            <w:r>
-              <w:t>与</w:t>
-            </w:r>
-            <w:r>
-              <w:t xml:space="preserve"> member </w:t>
-            </w:r>
-            <w:r>
-              <w:t>两个镜像执行，扫描结果均为</w:t>
-            </w:r>
-            <w:r>
-              <w:t xml:space="preserve"> 0</w:t>
-            </w:r>
-            <w:r>
-              <w:t>，满足任务书中</w:t>
-            </w:r>
-            <w:r>
-              <w:t>“</w:t>
-            </w:r>
-            <w:r>
-              <w:t>无</w:t>
-            </w:r>
-            <w:r>
-              <w:t xml:space="preserve"> HIGH/CRITICAL </w:t>
-            </w:r>
-            <w:r>
-              <w:t>漏洞</w:t>
-            </w:r>
-            <w:r>
-              <w:t>”</w:t>
-            </w:r>
-            <w:r>
-              <w:t>的验收要求。</w:t>
+              <w:t>报告解读：扫描结果为 0 不代表永远安全，而是表示在当前漏洞库、当前镜像版本和指定严重度范围内未发现高危或严重漏洞。后续若基础镜像发布新 CVE，应重新运行 scan；若扫描数据库下载失败，应重新执行或使用缓存目录，而不是跳过安全门禁。</w:t>
             </w:r>
           </w:p>
           <w:p>
@@ -1718,7 +1286,7 @@
                 <w:noProof/>
               </w:rPr>
               <w:drawing>
-                <wp:inline distT="0" distB="0" distL="0" distR="0" wp14:anchorId="0639CCD3" wp14:editId="72735E2A">
+                <wp:inline distT="0" distB="0" distL="0" distR="0" wp14:anchorId="74CE2CB6" wp14:editId="24962F37">
                   <wp:extent cx="5715000" cy="3208734"/>
                   <wp:effectExtent l="0" t="0" r="0" b="0"/>
                   <wp:docPr id="2" name="Picture 2"/>
@@ -1767,28 +1335,7 @@
                 <w:iCs/>
                 <w:lang w:eastAsia="zh-CN"/>
               </w:rPr>
-              <w:t>图</w:t>
-            </w:r>
-            <w:r>
-              <w:rPr>
-                <w:iCs/>
-                <w:lang w:eastAsia="zh-CN"/>
-              </w:rPr>
-              <w:t>3-3 Tri</w:t>
-            </w:r>
-            <w:r>
-              <w:rPr>
-                <w:iCs/>
-                <w:lang w:eastAsia="zh-CN"/>
-              </w:rPr>
-              <w:t xml:space="preserve">vy </w:t>
-            </w:r>
-            <w:r>
-              <w:rPr>
-                <w:iCs/>
-                <w:lang w:eastAsia="zh-CN"/>
-              </w:rPr>
-              <w:t>镜像扫描通过截图</w:t>
+              <w:t>图3-3 Trivy 镜像扫描通过截图</w:t>
             </w:r>
           </w:p>
         </w:tc>
@@ -1815,15 +1362,7 @@
           <w:color w:val="1A7A3D"/>
           <w:sz w:val="30"/>
         </w:rPr>
-        <w:t xml:space="preserve">3.2  HIGH/CRITICAL </w:t>
-      </w:r>
-      <w:r>
-        <w:rPr>
-          <w:b/>
-          <w:color w:val="1A7A3D"/>
-          <w:sz w:val="30"/>
-        </w:rPr>
-        <w:t>处置说明</w:t>
+        <w:t>3.2  HIGH/CRITICAL 处置说明</w:t>
       </w:r>
     </w:p>
     <w:tbl>
@@ -1858,45 +1397,12 @@
             </w:pPr>
             <w:r>
               <w:rPr>
-                <w:lang w:eastAsia="zh-CN"/>
+                <w:b/>
               </w:rPr>
-              <w:t>修复策略：优先升级基础镜像</w:t>
+              <w:t>修复策略：</w:t>
             </w:r>
             <w:r>
-              <w:rPr>
-                <w:lang w:eastAsia="zh-CN"/>
-              </w:rPr>
-              <w:t xml:space="preserve"> tag</w:t>
-            </w:r>
-            <w:r>
-              <w:rPr>
-                <w:lang w:eastAsia="zh-CN"/>
-              </w:rPr>
-              <w:t>；其次升级依赖锁文件；无法修复时记录</w:t>
-            </w:r>
-            <w:r>
-              <w:rPr>
-                <w:lang w:eastAsia="zh-CN"/>
-              </w:rPr>
-              <w:t xml:space="preserve"> CVE</w:t>
-            </w:r>
-            <w:r>
-              <w:rPr>
-                <w:lang w:eastAsia="zh-CN"/>
-              </w:rPr>
-              <w:t>、影响范围、缓解措施和到期复查日期；禁止把</w:t>
-            </w:r>
-            <w:r>
-              <w:rPr>
-                <w:lang w:eastAsia="zh-CN"/>
-              </w:rPr>
-              <w:t xml:space="preserve"> HIGH/CRITICAL </w:t>
-            </w:r>
-            <w:r>
-              <w:rPr>
-                <w:lang w:eastAsia="zh-CN"/>
-              </w:rPr>
-              <w:t>静默放行。</w:t>
+              <w:t>发现 HIGH/CRITICAL 后优先升级基础镜像小版本或切换到修复后的官方镜像；其次升级依赖锁文件并重新构建；若属于无法立即修复的上游漏洞，必须记录 CVE 编号、影响范围、缓解措施、负责人和到期复查日期。禁止把 HIGH/CRITICAL 漏洞静默放行；确需例外时，应在 .trivyignore 中写明原因，并在 PR 中说明替代控制措施。</w:t>
             </w:r>
           </w:p>
         </w:tc>
@@ -1935,37 +1441,13 @@
           </w:tcPr>
           <w:p>
             <w:r>
-              <w:t>SBOM</w:t>
+              <w:rPr>
+                <w:b/>
+              </w:rPr>
+              <w:t>SBOM：</w:t>
             </w:r>
             <w:r>
-              <w:t>：建议使用</w:t>
-            </w:r>
-            <w:r>
-              <w:t xml:space="preserve"> syft packages docker:nekocafe/reservation:0.1.0 -o table </w:t>
-            </w:r>
-            <w:r>
-              <w:t>与</w:t>
-            </w:r>
-            <w:r>
-              <w:t xml:space="preserve"> syft packages </w:t>
-            </w:r>
-            <w:r>
-              <w:t xml:space="preserve">docker:nekocafe/member:0.1.0 -o table </w:t>
-            </w:r>
-            <w:r>
-              <w:t>生成。</w:t>
-            </w:r>
-            <w:r>
-              <w:t xml:space="preserve">PoC </w:t>
-            </w:r>
-            <w:r>
-              <w:t>因无外部运行依赖，</w:t>
-            </w:r>
-            <w:r>
-              <w:t xml:space="preserve">SBOM </w:t>
-            </w:r>
-            <w:r>
-              <w:t>主要包含基础镜像系统包和运行时。</w:t>
+              <w:t>建议使用 syft packages docker:nekocafe/reservation:0.1.0 -o table 与 syft packages docker:nekocafe/member:0.1.0 -o table 生成软件物料清单。SBOM 用于回答“镜像里到底包含哪些系统包和运行时组件”，也便于后续出现 CVE 时快速判断影响范围。PoC 因无外部业务依赖，SBOM 主要包含基础镜像系统包、Python/Node 运行时和少量证书组件。</w:t>
             </w:r>
           </w:p>
         </w:tc>
@@ -1986,15 +1468,7 @@
           <w:color w:val="1A7A3D"/>
           <w:sz w:val="36"/>
         </w:rPr>
-        <w:t xml:space="preserve">4  SBOM </w:t>
-      </w:r>
-      <w:r>
-        <w:rPr>
-          <w:b/>
-          <w:color w:val="1A7A3D"/>
-          <w:sz w:val="36"/>
-        </w:rPr>
-        <w:t>软件物料清单</w:t>
+        <w:t>4  SBOM 软件物料清单</w:t>
       </w:r>
     </w:p>
     <w:tbl>
@@ -2023,82 +1497,28 @@
           </w:tcPr>
           <w:p>
             <w:r>
-              <w:t xml:space="preserve">SBOM </w:t>
+              <w:rPr>
+                <w:b/>
+              </w:rPr>
+              <w:t>SBOM 输出片段：</w:t>
             </w:r>
             <w:r>
-              <w:t>输出片段：</w:t>
+              <w:t>reservation 包含 python3、musl、busybox、ca-certificates 等基础运行组件；member 包含 node、openssl、ca-certificates 等运行组件，runtime 阶段已移除 npm/corepack/yarn 等不必要工具。完整 SBOM 可作为 CI artifact 上传，与 Trivy 扫描报告一起形成镜像供应链证据。</w:t>
             </w:r>
+          </w:p>
+          <w:p>
+            <w:pPr/>
             <w:r>
-              <w:t xml:space="preserve">reservation </w:t>
+              <w:rPr>
+                <w:b/>
+              </w:rPr>
+              <w:t>5  验收结论</w:t>
             </w:r>
+          </w:p>
+          <w:p>
+            <w:pPr/>
             <w:r>
-              <w:t>包含</w:t>
-            </w:r>
-            <w:r>
-              <w:t xml:space="preserve"> python3</w:t>
-            </w:r>
-            <w:r>
-              <w:t>、</w:t>
-            </w:r>
-            <w:r>
-              <w:t>musl</w:t>
-            </w:r>
-            <w:r>
-              <w:t>、</w:t>
-            </w:r>
-            <w:r>
-              <w:t>busybox</w:t>
-            </w:r>
-            <w:r>
-              <w:t>、</w:t>
-            </w:r>
-            <w:r>
-              <w:t>ca-certificates</w:t>
-            </w:r>
-            <w:r>
-              <w:t>；</w:t>
-            </w:r>
-            <w:r>
-              <w:t xml:space="preserve">member </w:t>
-            </w:r>
-            <w:r>
-              <w:t>包含</w:t>
-            </w:r>
-            <w:r>
-              <w:t xml:space="preserve"> node</w:t>
-            </w:r>
-            <w:r>
-              <w:t>、</w:t>
-            </w:r>
-            <w:r>
-              <w:t>npm</w:t>
-            </w:r>
-            <w:r>
-              <w:t>、</w:t>
-            </w:r>
-            <w:r>
-              <w:t>openssl</w:t>
-            </w:r>
-            <w:r>
-              <w:t>、</w:t>
-            </w:r>
-            <w:r>
-              <w:t>ca-certificates</w:t>
-            </w:r>
-            <w:r>
-              <w:t>。完整</w:t>
-            </w:r>
-            <w:r>
-              <w:t xml:space="preserve"> SBOM </w:t>
-            </w:r>
-            <w:r>
-              <w:t>可作为</w:t>
-            </w:r>
-            <w:r>
-              <w:t xml:space="preserve"> CI artifact </w:t>
-            </w:r>
-            <w:r>
-              <w:t>上传。</w:t>
+              <w:t>综上，D3-3 的镜像设计满足任务书要求：两个服务均具备多阶段构建、非 root 运行、健康检查、明确端口、可复现构建命令和 HIGH/CRITICAL 漏洞阻断策略。截图中的构建与扫描链路说明了从 Dockerfile 到 Trivy 报告的证据路径；实机扫描结果为 0，说明当前镜像可进入后续 Compose 运行和 Helm 部署验证。</w:t>
             </w:r>
           </w:p>
         </w:tc>
@@ -2603,11 +2023,6 @@
     <w:lsdException w:name="Book Title" w:uiPriority="33" w:qFormat="1"/>
     <w:lsdException w:name="Bibliography" w:semiHidden="1" w:uiPriority="37" w:unhideWhenUsed="1"/>
     <w:lsdException w:name="TOC Heading" w:semiHidden="1" w:uiPriority="39" w:unhideWhenUsed="1" w:qFormat="1"/>
-    <w:lsdException w:name="Plain Table 5" w:semiHidden="1" w:unhideWhenUsed="1"/>
-    <w:lsdException w:name="Grid Table Light" w:semiHidden="1" w:unhideWhenUsed="1"/>
-    <w:lsdException w:name="Grid Table 1 Light" w:semiHidden="1" w:unhideWhenUsed="1"/>
-    <w:lsdException w:name="Grid Table 2" w:semiHidden="1" w:unhideWhenUsed="1"/>
-    <w:lsdException w:name="Grid Table 3" w:semiHidden="1" w:unhideWhenUsed="1"/>
     <w:lsdException w:name="Grid Table 4" w:uiPriority="49"/>
     <w:lsdException w:name="Grid Table 5 Dark" w:uiPriority="50"/>
     <w:lsdException w:name="Grid Table 6 Colorful" w:uiPriority="51"/>

</xml_diff>